<commit_message>
Update dynamic routing notes from the revised sheet; correct my earlier note about a cut-off sentence
Co-Authored-By: Claude Sonnet 5.5 <noreply@anthropic.com>
Claude-Session: https://claude.ai/code/session_01FAGx9qgJn3u4VmZ6fESEv2
</commit_message>
<xml_diff>
--- a/study-notes/video-notes/CCNA_Dynamic_Routing.docx
+++ b/study-notes/video-notes/CCNA_Dynamic_Routing.docx
@@ -176,6 +176,7 @@
         <w:shd w:val="clear" w:color="auto" w:fill="E6F0FB"/>
         <w:spacing w:before="100" w:after="60"/>
       </w:pPr>
+      <w:proofErr w:type="gramStart"/>
       <w:r>
         <w:rPr>
           <w:b/>
@@ -184,7 +185,18 @@
           <w:sz w:val="20"/>
           <w:szCs w:val="20"/>
         </w:rPr>
-        <w:t>📝  Key concepts and dot points</w:t>
+        <w:t>📝  Key</w:t>
+      </w:r>
+      <w:proofErr w:type="gramEnd"/>
+      <w:r>
+        <w:rPr>
+          <w:b/>
+          <w:bCs/>
+          <w:color w:val="1A3A6B"/>
+          <w:sz w:val="20"/>
+          <w:szCs w:val="20"/>
+        </w:rPr>
+        <w:t xml:space="preserve"> concepts and dot points</w:t>
       </w:r>
     </w:p>
     <w:p>
@@ -463,6 +475,9 @@
         <w:spacing w:after="160"/>
       </w:pPr>
       <w:r>
+        <w:rPr>
+          <w:noProof/>
+        </w:rPr>
         <w:lastRenderedPageBreak/>
         <w:drawing>
           <wp:inline distT="0" distB="0" distL="0" distR="0" wp14:anchorId="2012AB91" wp14:editId="5EF5D91E">
@@ -1013,6 +1028,9 @@
         <w:spacing w:after="160"/>
       </w:pPr>
       <w:r>
+        <w:rPr>
+          <w:noProof/>
+        </w:rPr>
         <w:drawing>
           <wp:inline distT="0" distB="0" distL="0" distR="0" wp14:anchorId="28F37C5E" wp14:editId="0DE01AC0">
             <wp:extent cx="5495925" cy="3130169"/>
@@ -1200,6 +1218,9 @@
         <w:spacing w:after="160"/>
       </w:pPr>
       <w:r>
+        <w:rPr>
+          <w:noProof/>
+        </w:rPr>
         <w:lastRenderedPageBreak/>
         <w:drawing>
           <wp:inline distT="0" distB="0" distL="0" distR="0" wp14:anchorId="66955B45" wp14:editId="74BD9AE1">
@@ -1303,18 +1324,25 @@
         <w:spacing w:after="160"/>
       </w:pPr>
       <w:r>
-        <w:t xml:space="preserve">The route will be inactive </w:t>
-      </w:r>
-      <w:r>
-        <w:t xml:space="preserve"> (not in the routing table) unless the route learned </w:t>
-      </w:r>
-      <w:proofErr w:type="spellStart"/>
-      <w:r>
-        <w:t>bu</w:t>
-      </w:r>
-      <w:proofErr w:type="spellEnd"/>
-      <w:r>
-        <w:t xml:space="preserve"> the dynamic routing protocol is removed (for example, the more router stops advertising it for some reason, or an interface failure causes an adjac</w:t>
+        <w:t xml:space="preserve">The route will be </w:t>
+      </w:r>
+      <w:r>
+        <w:t>inactive (</w:t>
+      </w:r>
+      <w:r>
+        <w:t>not in the routing table) unless the route learned b</w:t>
+      </w:r>
+      <w:r>
+        <w:t>y</w:t>
+      </w:r>
+      <w:r>
+        <w:t xml:space="preserve"> the dynamic routing protocol is removed (for example, the </w:t>
+      </w:r>
+      <w:r>
+        <w:t>remote</w:t>
+      </w:r>
+      <w:r>
+        <w:t xml:space="preserve"> router stops advertising it for some reason, or an interface failure causes an adjac</w:t>
       </w:r>
       <w:r>
         <w:t>ency with a neighbour to be lost).</w:t>

</xml_diff>